<commit_message>
Atualiza relatório para refletir a demonstração pública
</commit_message>
<xml_diff>
--- a/docs/Relatorio_Manager_School.docx
+++ b/docs/Relatorio_Manager_School.docx
@@ -47,7 +47,7 @@
           <w:color w:val="292B26"/>
           <w:sz w:val="24"/>
         </w:rPr>
-        <w:t>Instituição:  __________________________________________</w:t>
+        <w:t>Projeto de estudo e portfólio</w:t>
       </w:r>
     </w:p>
     <w:p>
@@ -61,7 +61,7 @@
           <w:color w:val="292B26"/>
           <w:sz w:val="24"/>
         </w:rPr>
-        <w:t>Curso/turma:  __________________________________________</w:t>
+        <w:t>Curso de Programação em Python — Fábrica de Programadores</w:t>
       </w:r>
     </w:p>
     <w:p>
@@ -75,7 +75,7 @@
           <w:color w:val="292B26"/>
           <w:sz w:val="24"/>
         </w:rPr>
-        <w:t>Integrantes:  __________________________________________</w:t>
+        <w:t>Autor: Miguel Henrique da Silva Galvão</w:t>
       </w:r>
     </w:p>
     <w:p>
@@ -89,7 +89,7 @@
           <w:color w:val="292B26"/>
           <w:sz w:val="24"/>
         </w:rPr>
-        <w:t>Orientador(a):  __________________________________________</w:t>
+        <w:t>Parceria: SENAI-SP e Prefeitura de Santana de Parnaíba</w:t>
       </w:r>
     </w:p>
     <w:p/>
@@ -111,106 +111,6 @@
     <w:p>
       <w:r>
         <w:br w:type="page"/>
-      </w:r>
-    </w:p>
-    <w:p>
-      <w:r>
-        <w:rPr>
-          <w:rFonts w:ascii="Times New Roman" w:hAnsi="Times New Roman"/>
-          <w:b/>
-          <w:color w:val="292B26"/>
-          <w:sz w:val="24"/>
-        </w:rPr>
-        <w:t>Instituição:</w:t>
-      </w:r>
-      <w:r>
-        <w:rPr>
-          <w:rFonts w:ascii="Times New Roman" w:hAnsi="Times New Roman"/>
-          <w:b w:val="0"/>
-          <w:color w:val="292B26"/>
-          <w:sz w:val="24"/>
-        </w:rPr>
-        <w:t xml:space="preserve"> [preencher]</w:t>
-      </w:r>
-    </w:p>
-    <w:p>
-      <w:r>
-        <w:rPr>
-          <w:rFonts w:ascii="Times New Roman" w:hAnsi="Times New Roman"/>
-          <w:b/>
-          <w:color w:val="292B26"/>
-          <w:sz w:val="24"/>
-        </w:rPr>
-        <w:t>Curso/turma:</w:t>
-      </w:r>
-      <w:r>
-        <w:rPr>
-          <w:rFonts w:ascii="Times New Roman" w:hAnsi="Times New Roman"/>
-          <w:b w:val="0"/>
-          <w:color w:val="292B26"/>
-          <w:sz w:val="24"/>
-        </w:rPr>
-        <w:t xml:space="preserve"> [preencher]</w:t>
-      </w:r>
-    </w:p>
-    <w:p>
-      <w:r>
-        <w:rPr>
-          <w:rFonts w:ascii="Times New Roman" w:hAnsi="Times New Roman"/>
-          <w:b/>
-          <w:color w:val="292B26"/>
-          <w:sz w:val="24"/>
-        </w:rPr>
-        <w:t>Integrantes:</w:t>
-      </w:r>
-      <w:r>
-        <w:rPr>
-          <w:rFonts w:ascii="Times New Roman" w:hAnsi="Times New Roman"/>
-          <w:b w:val="0"/>
-          <w:color w:val="292B26"/>
-          <w:sz w:val="24"/>
-        </w:rPr>
-        <w:t xml:space="preserve"> [preencher]</w:t>
-      </w:r>
-    </w:p>
-    <w:p>
-      <w:r>
-        <w:rPr>
-          <w:rFonts w:ascii="Times New Roman" w:hAnsi="Times New Roman"/>
-          <w:b/>
-          <w:color w:val="292B26"/>
-          <w:sz w:val="24"/>
-        </w:rPr>
-        <w:t>Orientador(a):</w:t>
-      </w:r>
-      <w:r>
-        <w:rPr>
-          <w:rFonts w:ascii="Times New Roman" w:hAnsi="Times New Roman"/>
-          <w:b w:val="0"/>
-          <w:color w:val="292B26"/>
-          <w:sz w:val="24"/>
-        </w:rPr>
-        <w:t xml:space="preserve"> [preencher]</w:t>
-      </w:r>
-    </w:p>
-    <w:p>
-      <w:r>
-        <w:rPr>
-          <w:rFonts w:ascii="Times New Roman" w:hAnsi="Times New Roman"/>
-          <w:b/>
-          <w:color w:val="292B26"/>
-          <w:sz w:val="24"/>
-        </w:rPr>
-        <w:t>Local e ano:</w:t>
-      </w:r>
-      <w:r>
-        <w:rPr>
-          <w:rFonts w:ascii="Times New Roman" w:hAnsi="Times New Roman"/>
-          <w:b w:val="0"/>
-          <w:color w:val="292B26"/>
-          <w:sz w:val="24"/>
-        </w:rPr>
-        <w:t xml:space="preserve"> [preencher]</w:t>
       </w:r>
     </w:p>
     <w:p>
@@ -244,7 +144,7 @@
           <w:color w:val="292B26"/>
           <w:sz w:val="24"/>
         </w:rPr>
-        <w:t>O projeto foi desenvolvido como exercício acadêmico para praticar programação em Python, organização de dados relacionais, criação de páginas web e geração de relatórios.</w:t>
+        <w:t>O projeto foi desenvolvido como estudo e portfólio durante o curso de Programação em Python da Fábrica de Programadores, realizado em parceria entre o SENAI-SP e a Prefeitura de Santana de Parnaíba. A proposta é revisar conceitos do curso e aprender novas tecnologias construindo uma aplicação web.</w:t>
       </w:r>
     </w:p>
     <w:p>
@@ -400,7 +300,7 @@
           <w:color w:val="292B26"/>
           <w:sz w:val="24"/>
         </w:rPr>
-        <w:t>O sistema não possui perfis distintos de usuário, trilha de auditoria, sincronização entre várias escolas ou política automática de cópias de segurança. É um protótipo de demonstração, não um diário escolar oficial.</w:t>
+        <w:t>O sistema não possui perfis distintos de usuário, trilha de auditoria, sincronização entre várias escolas ou política automática de cópias de segurança. É um protótipo de estudo e portfólio, não um diário escolar oficial.</w:t>
       </w:r>
     </w:p>
     <w:p>
@@ -865,7 +765,7 @@
           <w:color w:val="292B26"/>
           <w:sz w:val="22"/>
         </w:rPr>
-        <w:t>**RNF04 — Segurança básica:** formulários POST validam token CSRF; a aplicação pode exigir login quando `APP_PASSWORD` estiver configurada.</w:t>
+        <w:t>**RNF04 — Segurança básica:** formulários POST validam token CSRF. O modo local pode exigir login quando `APP_PASSWORD` estiver configurada; a demonstração pública não exige login e bloqueia alterações.</w:t>
       </w:r>
     </w:p>
     <w:p>
@@ -1392,7 +1292,7 @@
           <w:color w:val="292B26"/>
           <w:sz w:val="24"/>
         </w:rPr>
-        <w:t>O arquivo SQLite é local e está excluído do controle de versão. Para a demonstração hospedada, o render.yaml gera valores para SECRET_KEY e APP_PASSWORD; o acesso é feito com o usuário apresentacao e a senha configurada no painel do serviço. Não publique essa senha, nem preencha o banco online com dados reais de estudantes.</w:t>
+        <w:t>O banco SQLite local está excluído do controle de versão. A demonstração pública usa `DEMO_MODE=1`, dados fictícios e não solicita login. O modo de demonstração bloqueia alterações e usa armazenamento temporário, portanto os dados podem ser recriados quando o serviço reiniciar. Nunca utilize nomes, notas ou outros dados reais de estudantes na versão online.</w:t>
       </w:r>
     </w:p>
     <w:p>
@@ -1507,7 +1407,7 @@
           <w:color w:val="292B26"/>
           <w:sz w:val="24"/>
         </w:rPr>
-        <w:t>A implantação preparada usa Render com disco persistente montado em /var/data; DATABASE_PATH aponta o SQLite para esse disco. O plano Render que suporta disco persistente é pago. Não usar o serviço gratuito para guardar dados SQLite importantes, pois o sistema de arquivos gratuito é temporário. Os passos e a alternativa gratuita de demonstração estão em [implantacao.md](implantacao.md).</w:t>
+        <w:t>A demonstração está hospedada gratuitamente no Render, na URL https://manager-school-demo.onrender.com/. O serviço pode entrar em repouso após um período sem acessos, fazendo a primeira visita demorar. O armazenamento é temporário e os registros de exemplo podem ser recriados quando a aplicação reiniciar. Essa implantação é somente para consulta e não deve guardar dados reais. Para hospedar a versão completa com persistência, será necessário configurar armazenamento persistente ou um banco de dados gerenciado. Consulte [implantacao.md](implantacao.md) para os detalhes.</w:t>
       </w:r>
     </w:p>
     <w:p>
@@ -1634,7 +1534,7 @@
           <w:color w:val="292B26"/>
           <w:sz w:val="24"/>
         </w:rPr>
-        <w:t>O Manager School reúne em uma aplicação os registros básicos de notas e oferece formas de consultar e resumir os resultados. O desenvolvimento aplica conceitos de rotas web, persistência relacional, validação, análise de dados e geração de arquivos. Como próximo passo, o projeto precisa ser comparado aos critérios oficiais do TCC e apresentado com uma base de demonstração inteiramente fictícia.</w:t>
+        <w:t>O Manager School reúne registros básicos de notas e oferece formas de consultar e resumir resultados. Durante o desenvolvimento, foram praticados conceitos de rotas web, persistência relacional, validação, análise de dados e geração de arquivos. Como próximos passos, o projeto pode receber testes automatizados, contas individuais e armazenamento persistente. A demonstração pública utiliza exclusivamente dados fictícios.</w:t>
       </w:r>
     </w:p>
     <w:p>

</xml_diff>